<commit_message>
Source-verify DUAA 2025 citation; correct short title; add currency note
Captain supplied the DUAA implementation tracker (27 Apr 2026). Confirmed
and folded in:
- Correct short title: Data (Use and Access) Act 2025 (with parentheses).
- Ref 15 now source-verified with real commencement facts: Royal Assent
  19 Jun 2025; principal Part 5 data-protection reforms in force 5 Feb
  2026; s.103 data-subject complaints-handling duty from 19 Jun 2026;
  ICO being reconstituted as the Information Commission by summer 2026.
- Technical Report compliance section gains a currency note on the DUAA
  transition (treat as configurable policy in any production build).

Reports regenerated. Ref 15 caveat removed; only ref 17 (ICO vetting
wording) remains knowledge-verified pending its source.

Co-Authored-By: Claude Opus 4.8 <noreply@anthropic.com>
Claude-Session: https://claude.ai/code/session_012EFETGbhdxdnPCjpmQ9UDz
</commit_message>
<xml_diff>
--- a/Santander_Technical_Report.docx
+++ b/Santander_Technical_Report.docx
@@ -3256,6 +3256,21 @@
     </w:p>
     <w:p>
       <w:pPr>
+        <w:spacing w:before="0" w:after="120"/>
+      </w:pPr>
+      <w:r>
+        <w:rPr>
+          <w:rFonts w:ascii="Calibri" w:hAnsi="Calibri"/>
+          <w:b w:val="0"/>
+          <w:i w:val="0"/>
+          <w:color w:val="1C1917"/>
+          <w:sz w:val="21"/>
+        </w:rPr>
+        <w:t>The data-protection references reflect the UK regime as reshaped by the Data (Use and Access) Act 2025, whose principal reforms took effect on 5 February 2026; a data-subject complaints-handling duty follows on 19 June 2026 [15]. A production build would need to track that transition — including the regulator's reconstitution as the Information Commission — as configurable policy rather than fixed assumptions.</w:t>
+      </w:r>
+    </w:p>
+    <w:p>
+      <w:pPr>
         <w:spacing w:before="280" w:after="20"/>
       </w:pPr>
       <w:r>
@@ -4144,7 +4159,7 @@
           <w:color w:val="1C1917"/>
           <w:sz w:val="18"/>
         </w:rPr>
-        <w:t>UK GDPR and the Data Protection Act 2018 (as amended by the Data Use and Access Act 2025), Article 5(1)(c) — data minimisation and purpose limitation.</w:t>
+        <w:t>UK GDPR and the Data Protection Act 2018, as amended by the Data (Use and Access) Act 2025 (Royal Assent 19 June 2025; principal data-protection reforms in Part 5 in force from 5 February 2026; a data-subject complaints-handling duty under s.103 from 19 June 2026; the regulator is being reconstituted as the Information Commission). Article 5(1)(c) — data minimisation and purpose limitation.</w:t>
       </w:r>
     </w:p>
     <w:p>

</xml_diff>

<commit_message>
DUAA now-in-force update; note ICO page's year typo
ICO vetting page carries a DSIT notice that the DUAA's data-protection
and PECR provisions are now fully in force. Updated ref 15 and the
compliance currency note from future/near tense to "now in force"
(Part 5 from 5 Feb 2026; s.103 complaints duty from 19 Jun 2026).
Kept the correct short title Data (Use and Access) Act 2025 and recorded
in CITATIONS.md that the ICO page mislabels it as "2026" (Royal Assent
was 19 Jun 2025). Reports regenerated.

Co-Authored-By: Claude Opus 4.8 <noreply@anthropic.com>
Claude-Session: https://claude.ai/code/session_012EFETGbhdxdnPCjpmQ9UDz
</commit_message>
<xml_diff>
--- a/Santander_Technical_Report.docx
+++ b/Santander_Technical_Report.docx
@@ -3266,7 +3266,7 @@
           <w:color w:val="1C1917"/>
           <w:sz w:val="21"/>
         </w:rPr>
-        <w:t>The data-protection references reflect the UK regime as reshaped by the Data (Use and Access) Act 2025, whose principal reforms took effect on 5 February 2026; a data-subject complaints-handling duty follows on 19 June 2026 [15]. A production build would need to track that transition — including the regulator's reconstitution as the Information Commission — as configurable policy rather than fixed assumptions.</w:t>
+        <w:t>The data-protection references reflect the UK regime as reshaped by the Data (Use and Access) Act 2025, whose data-protection and PECR provisions are now in force — the principal Part 5 reforms from 5 February 2026 and the data-subject complaints-handling duty from 19 June 2026 [15]. A production build would need to reflect that settled position — including the regulator's reconstitution as the Information Commission — as configurable policy rather than fixed assumptions.</w:t>
       </w:r>
     </w:p>
     <w:p>
@@ -4159,7 +4159,7 @@
           <w:color w:val="1C1917"/>
           <w:sz w:val="18"/>
         </w:rPr>
-        <w:t>UK GDPR and the Data Protection Act 2018, as amended by the Data (Use and Access) Act 2025 (Royal Assent 19 June 2025; principal data-protection reforms in Part 5 in force from 5 February 2026; a data-subject complaints-handling duty under s.103 from 19 June 2026; the regulator is being reconstituted as the Information Commission). Article 5(1)(c) — data minimisation and purpose limitation.</w:t>
+        <w:t>UK GDPR and the Data Protection Act 2018, as amended by the Data (Use and Access) Act 2025 (Royal Assent 19 June 2025). Per the ICO/DSIT, the data-protection and PECR provisions are now in force — the principal Part 5 reforms from 5 February 2026 and the data-subject complaints-handling duty (s.103) from 19 June 2026 — and the regulator is being reconstituted as the Information Commission. Article 5(1)(c) — data minimisation and purpose limitation.</w:t>
       </w:r>
     </w:p>
     <w:p>

</xml_diff>